<commit_message>
Instrument v3: add Advisor Alignment Map — every design change traced to Dr. Rey's minuted directives (May 20: 2-3 AI boxes, model intact, start dissertation immediately; late-July: broaden population, early collection, 20-30 floor); core-trim flagged as the one open decision for his sign-off
Co-Authored-By: Claude Fable 5 <noreply@anthropic.com>
Claude-Session: https://claude.ai/code/session_019uQWfMoV11me5yJ6LYRtPv
</commit_message>
<xml_diff>
--- a/dba/Dissertation_Instrument_v3_DRAFT.docx
+++ b/dba/Dissertation_Instrument_v3_DRAFT.docx
@@ -24,6 +24,190 @@
           <w:b/>
         </w:rPr>
         <w:t>Status: DO NOT FIELD until (1) advisor/committee sign-off and (2) IRB amendment to IRB-25-0462 (new items + broadened population) is approved.</w:t>
+      </w:r>
+    </w:p>
+    <w:p>
+      <w:r>
+        <w:br/>
+      </w:r>
+    </w:p>
+    <w:p>
+      <w:pPr>
+        <w:pStyle w:val="Heading2"/>
+      </w:pPr>
+      <w:r>
+        <w:t>0 · Advisor Alignment Map — every change traces to Dr. Rey's own directives</w:t>
+      </w:r>
+    </w:p>
+    <w:p>
+      <w:r>
+        <w:t>| v3 change | Dr. Rey's words (from the minuted meetings) | Source |</w:t>
+      </w:r>
+    </w:p>
+    <w:p>
+      <w:r>
+        <w:t>|---|---|---|</w:t>
+      </w:r>
+    </w:p>
+    <w:p>
+      <w:r>
+        <w:t xml:space="preserve">| </w:t>
+      </w:r>
+      <w:r>
+        <w:rPr>
+          <w:b/>
+        </w:rPr>
+        <w:t>Add exactly 3 AI boxes</w:t>
+      </w:r>
+      <w:r>
+        <w:t xml:space="preserve"> (Automated Anchoring, Sycophantic Confirmation, Recursive Epistemic Drift) onto the intact core | </w:t>
+      </w:r>
+      <w:r>
+        <w:rPr>
+          <w:i/>
+        </w:rPr>
+        <w:t xml:space="preserve">"Tweak the model by incorporating </w:t>
+      </w:r>
+      <w:r>
+        <w:rPr>
+          <w:i/>
+        </w:rPr>
+        <w:t>2–3 boxes</w:t>
+      </w:r>
+      <w:r>
+        <w:rPr>
+          <w:i/>
+        </w:rPr>
+        <w:t xml:space="preserve"> related to AI and existing constructs"</w:t>
+      </w:r>
+      <w:r>
+        <w:t xml:space="preserve"> | May 20, 2026 meeting (Notion minutes) |</w:t>
+      </w:r>
+    </w:p>
+    <w:p>
+      <w:r>
+        <w:t xml:space="preserve">| </w:t>
+      </w:r>
+      <w:r>
+        <w:rPr>
+          <w:b/>
+        </w:rPr>
+        <w:t>Keep the 11-construct core intact</w:t>
+      </w:r>
+      <w:r>
+        <w:t xml:space="preserve"> — same constructs, same theory, same hypotheses framework | </w:t>
+      </w:r>
+      <w:r>
+        <w:rPr>
+          <w:i/>
+        </w:rPr>
+        <w:t>"Keep the existing research question and model without changes"</w:t>
+      </w:r>
+      <w:r>
+        <w:t xml:space="preserve"> (the model survives; the AI layer attaches to it, not replaces it) | May 20, 2026 |</w:t>
+      </w:r>
+    </w:p>
+    <w:p>
+      <w:r>
+        <w:t xml:space="preserve">| </w:t>
+      </w:r>
+      <w:r>
+        <w:rPr>
+          <w:b/>
+        </w:rPr>
+        <w:t>Timing: dissertation work begins now</w:t>
+      </w:r>
+      <w:r>
+        <w:t xml:space="preserve"> | </w:t>
+      </w:r>
+      <w:r>
+        <w:rPr>
+          <w:i/>
+        </w:rPr>
+        <w:t>"After completing research project, immediately begin working on dissertation"</w:t>
+      </w:r>
+      <w:r>
+        <w:t xml:space="preserve"> | May 20, 2026 |</w:t>
+      </w:r>
+    </w:p>
+    <w:p>
+      <w:r>
+        <w:t xml:space="preserve">| </w:t>
+      </w:r>
+      <w:r>
+        <w:rPr>
+          <w:b/>
+        </w:rPr>
+        <w:t>Broaden the population</w:t>
+      </w:r>
+      <w:r>
+        <w:t xml:space="preserve"> to risk &amp; assurance professionals | </w:t>
+      </w:r>
+      <w:r>
+        <w:rPr>
+          <w:i/>
+        </w:rPr>
+        <w:t>"Consider adjusting the population of interest to a broader group... industry-adjacent roles rather than auditors specifically"</w:t>
+      </w:r>
+      <w:r>
+        <w:t xml:space="preserve"> | Late-July 2026 resolution meeting |</w:t>
+      </w:r>
+    </w:p>
+    <w:p>
+      <w:r>
+        <w:t xml:space="preserve">| </w:t>
+      </w:r>
+      <w:r>
+        <w:rPr>
+          <w:b/>
+        </w:rPr>
+        <w:t>Start collection very early; plan a realistic floor</w:t>
+      </w:r>
+      <w:r>
+        <w:t xml:space="preserve"> | </w:t>
+      </w:r>
+      <w:r>
+        <w:rPr>
+          <w:i/>
+        </w:rPr>
+        <w:t>"Start data collection very early — it may take a year"; "20–30 respondents as a meaningful threshold"</w:t>
+      </w:r>
+      <w:r>
+        <w:t xml:space="preserve"> | Late-July 2026 |</w:t>
+      </w:r>
+    </w:p>
+    <w:p>
+      <w:r>
+        <w:t xml:space="preserve">| Future-research framing in the qualifying paper's final chapter | </w:t>
+      </w:r>
+      <w:r>
+        <w:rPr>
+          <w:i/>
+        </w:rPr>
+        <w:t>"Include recommendations for further research that explicitly mention investigating the impact of new AI technologies"</w:t>
+      </w:r>
+      <w:r>
+        <w:t xml:space="preserve"> | May 20, 2026 |</w:t>
+      </w:r>
+    </w:p>
+    <w:p>
+      <w:r>
+        <w:rPr>
+          <w:b/>
+        </w:rPr>
+        <w:t>The one deviation requiring his explicit sign-off:</w:t>
+      </w:r>
+      <w:r>
+        <w:t xml:space="preserve"> trimming the core from 5 to 3 items per construct (§1.2). "Keeping everything intact" argues for the full 55-item core; reach and length argue for the trim. </w:t>
+      </w:r>
+      <w:r>
+        <w:rPr>
+          <w:b/>
+        </w:rPr>
+        <w:t>Both versions are prepared — this is presented to Dr. Rey as his call, not assumed.</w:t>
+      </w:r>
+      <w:r>
+        <w:t xml:space="preserve"> Everything else in this document is execution of direction he has already given.</w:t>
       </w:r>
     </w:p>
     <w:p>

</xml_diff>

<commit_message>
Reframe Instrument v3 as parked concept sketch: pass course first, then minor tweaks only (broaden screeners + 2-3 AI boxes per Rey's own directives) — no commitments until his direction
Co-Authored-By: Claude Fable 5 <noreply@anthropic.com>
Claude-Session: https://claude.ai/code/session_019uQWfMoV11me5yJ6LYRtPv
</commit_message>
<xml_diff>
--- a/dba/Dissertation_Instrument_v3_DRAFT.docx
+++ b/dba/Dissertation_Instrument_v3_DRAFT.docx
@@ -7,7 +7,7 @@
         <w:pStyle w:val="Heading1"/>
       </w:pPr>
       <w:r>
-        <w:t>Instrument v3 (Dissertation) — DRAFT FOR ADVISOR + IRB REVIEW</w:t>
+        <w:t>Instrument v3 — CONCEPT SKETCH (not a commitment)</w:t>
       </w:r>
     </w:p>
     <w:p>
@@ -15,7 +15,7 @@
         <w:rPr>
           <w:b/>
         </w:rPr>
-        <w:t>Extends the validated qualifying-study instrument with the AI layer: Automated Anchoring · Sycophantic Confirmation · Recursive Epistemic Drift</w:t>
+        <w:t>Status: parked until (1) the course is passed, (2) the simulated-data exercise is done, and (3) Dr. Rey sets the dissertation direction in conversation. Nothing here is promised to anyone.</w:t>
       </w:r>
     </w:p>
     <w:p>
@@ -23,7 +23,19 @@
         <w:rPr>
           <w:b/>
         </w:rPr>
-        <w:t>Status: DO NOT FIELD until (1) advisor/committee sign-off and (2) IRB amendment to IRB-25-0462 (new items + broadened population) is approved.</w:t>
+        <w:t>The whole move, in one sentence:</w:t>
+      </w:r>
+      <w:r>
+        <w:t xml:space="preserve"> continue the same study with </w:t>
+      </w:r>
+      <w:r>
+        <w:rPr>
+          <w:b/>
+        </w:rPr>
+        <w:t>minor tweaks</w:t>
+      </w:r>
+      <w:r>
+        <w:t xml:space="preserve"> — broaden the screeners because the auditor-only population proved inaccessible (his late-July recommendation), and add the 2–3 AI boxes he prescribed in May because AI has significantly changed the landscape. Same model, same theory, same instrument core — adjusted where reality and the professor both already pointed.</w:t>
       </w:r>
     </w:p>
     <w:p>

</xml_diff>